<commit_message>
feat: added a new column to the output file
</commit_message>
<xml_diff>
--- a/template_saida/template_saida.docx
+++ b/template_saida/template_saida.docx
@@ -41,20 +41,50 @@
     <w:tbl>
       <w:tblPr>
         <w:tblStyle w:val="Tabelacomgrade"/>
-        <w:tblW w:w="16297" w:type="dxa"/>
+        <w:tblW w:w="16155" w:type="dxa"/>
         <w:tblLook w:val="04A0" w:firstRow="1" w:lastRow="0" w:firstColumn="1" w:lastColumn="0" w:noHBand="0" w:noVBand="1"/>
       </w:tblPr>
       <w:tblGrid>
         <w:gridCol w:w="1685"/>
-        <w:gridCol w:w="990"/>
+        <w:gridCol w:w="1571"/>
+        <w:gridCol w:w="1104"/>
         <w:gridCol w:w="1323"/>
-        <w:gridCol w:w="9889"/>
-        <w:gridCol w:w="2410"/>
+        <w:gridCol w:w="7637"/>
+        <w:gridCol w:w="2835"/>
       </w:tblGrid>
       <w:tr>
         <w:tc>
           <w:tcPr>
             <w:tcW w:w="1685" w:type="dxa"/>
+          </w:tcPr>
+          <w:p>
+            <w:pPr>
+              <w:spacing w:line="360" w:lineRule="auto"/>
+              <w:ind w:left="-113"/>
+              <w:jc w:val="center"/>
+              <w:rPr>
+                <w:rFonts w:ascii="Arial" w:eastAsia="Arial" w:hAnsi="Arial" w:cs="Arial"/>
+                <w:b/>
+                <w:bCs/>
+                <w:sz w:val="20"/>
+                <w:szCs w:val="20"/>
+              </w:rPr>
+            </w:pPr>
+            <w:r>
+              <w:rPr>
+                <w:rFonts w:ascii="Arial" w:eastAsia="Arial" w:hAnsi="Arial" w:cs="Arial"/>
+                <w:b/>
+                <w:bCs/>
+                <w:sz w:val="20"/>
+                <w:szCs w:val="20"/>
+              </w:rPr>
+              <w:t>Nª</w:t>
+            </w:r>
+          </w:p>
+        </w:tc>
+        <w:tc>
+          <w:tcPr>
+            <w:tcW w:w="1571" w:type="dxa"/>
           </w:tcPr>
           <w:p>
             <w:pPr>
@@ -82,7 +112,7 @@
         </w:tc>
         <w:tc>
           <w:tcPr>
-            <w:tcW w:w="990" w:type="dxa"/>
+            <w:tcW w:w="1104" w:type="dxa"/>
           </w:tcPr>
           <w:p>
             <w:pPr>
@@ -138,7 +168,7 @@
         </w:tc>
         <w:tc>
           <w:tcPr>
-            <w:tcW w:w="9889" w:type="dxa"/>
+            <w:tcW w:w="7637" w:type="dxa"/>
           </w:tcPr>
           <w:p>
             <w:pPr>
@@ -166,7 +196,7 @@
         </w:tc>
         <w:tc>
           <w:tcPr>
-            <w:tcW w:w="2410" w:type="dxa"/>
+            <w:tcW w:w="2835" w:type="dxa"/>
           </w:tcPr>
           <w:p>
             <w:pPr>
@@ -206,6 +236,48 @@
               <w:spacing w:line="360" w:lineRule="auto"/>
               <w:jc w:val="center"/>
               <w:rPr>
+                <w:rFonts w:ascii="Arial" w:hAnsi="Arial" w:cs="Arial"/>
+                <w:sz w:val="20"/>
+                <w:szCs w:val="20"/>
+              </w:rPr>
+            </w:pPr>
+            <w:r>
+              <w:rPr>
+                <w:rFonts w:ascii="Arial" w:hAnsi="Arial" w:cs="Arial"/>
+                <w:sz w:val="20"/>
+                <w:szCs w:val="20"/>
+              </w:rPr>
+              <w:t>{</w:t>
+            </w:r>
+            <w:proofErr w:type="spellStart"/>
+            <w:r>
+              <w:rPr>
+                <w:rFonts w:ascii="Arial" w:hAnsi="Arial" w:cs="Arial"/>
+                <w:sz w:val="20"/>
+                <w:szCs w:val="20"/>
+              </w:rPr>
+              <w:t>numero_id</w:t>
+            </w:r>
+            <w:proofErr w:type="spellEnd"/>
+            <w:r>
+              <w:rPr>
+                <w:rFonts w:ascii="Arial" w:hAnsi="Arial" w:cs="Arial"/>
+                <w:sz w:val="20"/>
+                <w:szCs w:val="20"/>
+              </w:rPr>
+              <w:t>}</w:t>
+            </w:r>
+          </w:p>
+        </w:tc>
+        <w:tc>
+          <w:tcPr>
+            <w:tcW w:w="1571" w:type="dxa"/>
+          </w:tcPr>
+          <w:p>
+            <w:pPr>
+              <w:spacing w:line="360" w:lineRule="auto"/>
+              <w:jc w:val="center"/>
+              <w:rPr>
                 <w:rFonts w:ascii="Arial" w:eastAsia="Arial" w:hAnsi="Arial" w:cs="Arial"/>
                 <w:sz w:val="20"/>
                 <w:szCs w:val="20"/>
@@ -223,7 +295,7 @@
         </w:tc>
         <w:tc>
           <w:tcPr>
-            <w:tcW w:w="990" w:type="dxa"/>
+            <w:tcW w:w="1104" w:type="dxa"/>
           </w:tcPr>
           <w:p>
             <w:pPr>
@@ -271,7 +343,7 @@
         </w:tc>
         <w:tc>
           <w:tcPr>
-            <w:tcW w:w="9889" w:type="dxa"/>
+            <w:tcW w:w="7637" w:type="dxa"/>
           </w:tcPr>
           <w:p>
             <w:pPr>
@@ -286,7 +358,7 @@
         </w:tc>
         <w:tc>
           <w:tcPr>
-            <w:tcW w:w="2410" w:type="dxa"/>
+            <w:tcW w:w="2835" w:type="dxa"/>
           </w:tcPr>
           <w:p>
             <w:pPr>

</xml_diff>